<commit_message>
chore: add repository link to report
</commit_message>
<xml_diff>
--- a/Spr.docx
+++ b/Spr.docx
@@ -1598,12 +1598,14 @@
         <w:rPr>
           <w:b/>
           <w:bCs/>
+          <w:lang w:val="pl-PL"/>
         </w:rPr>
       </w:pPr>
       <w:r>
         <w:rPr>
           <w:b/>
           <w:bCs/>
+          <w:lang w:val="pl-PL"/>
         </w:rPr>
         <w:t>1. Wybór dokładnej arytmetyki referencyjnej</w:t>
       </w:r>
@@ -3299,16 +3301,10 @@
       </m:oMathPara>
     </w:p>
     <w:p>
-      <w:pPr>
-        <w:rPr>
-          <w:lang w:val="pl-PL"/>
-        </w:rPr>
-      </w:pPr>
       <m:oMath>
         <m:r>
           <w:rPr>
             <w:rFonts w:ascii="Cambria Math" w:hAnsi="Cambria Math" w:cs="Century Schoolbook"/>
-            <w:lang w:val="pl-PL"/>
           </w:rPr>
           <m:t xml:space="preserve">= </m:t>
         </m:r>
@@ -3321,7 +3317,6 @@
         <m:r>
           <w:rPr>
             <w:rFonts w:ascii="Cambria Math" w:hAnsi="Cambria Math" w:cs="Century Schoolbook"/>
-            <w:lang w:val="pl-PL"/>
           </w:rPr>
           <m:t xml:space="preserve"> </m:t>
         </m:r>
@@ -3334,7 +3329,6 @@
         <m:r>
           <w:rPr>
             <w:rFonts w:ascii="Cambria Math" w:hAnsi="Cambria Math" w:cs="Century Schoolbook"/>
-            <w:lang w:val="pl-PL"/>
           </w:rPr>
           <m:t xml:space="preserve"> + </m:t>
         </m:r>
@@ -3347,7 +3341,6 @@
         <m:r>
           <w:rPr>
             <w:rFonts w:ascii="Cambria Math" w:hAnsi="Cambria Math" w:cs="Century Schoolbook"/>
-            <w:lang w:val="pl-PL"/>
           </w:rPr>
           <m:t xml:space="preserve"> </m:t>
         </m:r>
@@ -3360,7 +3353,6 @@
         <m:r>
           <w:rPr>
             <w:rFonts w:ascii="Cambria Math" w:hAnsi="Cambria Math" w:cs="Century Schoolbook"/>
-            <w:lang w:val="pl-PL"/>
           </w:rPr>
           <m:t xml:space="preserve"> </m:t>
         </m:r>
@@ -3373,15 +3365,11 @@
         <m:r>
           <w:rPr>
             <w:rFonts w:ascii="Cambria Math" w:hAnsi="Cambria Math" w:cs="Century Schoolbook"/>
-            <w:lang w:val="pl-PL"/>
           </w:rPr>
           <m:t>.</m:t>
         </m:r>
       </m:oMath>
       <w:r>
-        <w:rPr>
-          <w:lang w:val="pl-PL"/>
-        </w:rPr>
         <w:t>”</w:t>
       </w:r>
     </w:p>
@@ -3750,7 +3738,13 @@
         <w:t>puterowej składa się z kilku operacji:</w:t>
       </w:r>
     </w:p>
-    <w:p/>
+    <w:p>
+      <w:pPr>
+        <w:rPr>
+          <w:lang w:val="pl-PL"/>
+        </w:rPr>
+      </w:pPr>
+    </w:p>
     <w:p>
       <w:pPr>
         <w:rPr>
@@ -11986,7 +11980,7 @@
       <w:pPr>
         <w:rPr>
           <w:rFonts w:eastAsia="Times New Roman"/>
-          <w:lang w:eastAsia="pl-PL" w:bidi="ar-SA"/>
+          <w:lang w:val="pl-PL" w:eastAsia="pl-PL" w:bidi="ar-SA"/>
         </w:rPr>
       </w:pPr>
     </w:p>
@@ -11994,7 +11988,7 @@
       <w:pPr>
         <w:rPr>
           <w:rFonts w:eastAsia="Times New Roman"/>
-          <w:lang w:eastAsia="pl-PL" w:bidi="ar-SA"/>
+          <w:lang w:val="pl-PL" w:eastAsia="pl-PL" w:bidi="ar-SA"/>
         </w:rPr>
       </w:pPr>
       <w:r>
@@ -12083,6 +12077,12 @@
           <w:lang w:eastAsia="pl-PL" w:bidi="ar-SA"/>
         </w:rPr>
         <w:br/>
+      </w:r>
+      <w:r>
+        <w:rPr>
+          <w:rFonts w:eastAsia="Times New Roman"/>
+          <w:lang w:val="pl-PL" w:eastAsia="pl-PL" w:bidi="ar-SA"/>
+        </w:rPr>
         <w:t>— M. Møller.</w:t>
       </w:r>
     </w:p>
@@ -12092,13 +12092,16 @@
           <w:rFonts w:ascii="Times New Roman" w:eastAsia="Times New Roman" w:hAnsi="Times New Roman" w:cs="Times New Roman"/>
           <w:sz w:val="24"/>
           <w:szCs w:val="24"/>
-          <w:lang w:eastAsia="pl-PL" w:bidi="ar-SA"/>
+          <w:lang w:val="pl-PL" w:eastAsia="pl-PL" w:bidi="ar-SA"/>
         </w:rPr>
       </w:pPr>
     </w:p>
     <w:p>
       <w:pPr>
         <w:ind w:left="360"/>
+        <w:rPr>
+          <w:lang w:val="pl-PL"/>
+        </w:rPr>
       </w:pPr>
     </w:p>
     <w:p>
@@ -12149,21 +12152,7 @@
             <w:rFonts w:ascii="Cambria Math" w:hAnsi="Cambria Math"/>
             <w:lang w:val="pl-PL"/>
           </w:rPr>
-          <m:t>u</m:t>
-        </m:r>
-        <m:r>
-          <w:rPr>
-            <w:rFonts w:ascii="Cambria Math" w:hAnsi="Cambria Math"/>
-            <w:lang w:val="pl-PL"/>
-          </w:rPr>
-          <m:t>lp</m:t>
-        </m:r>
-        <m:r>
-          <w:rPr>
-            <w:rFonts w:ascii="Cambria Math" w:hAnsi="Cambria Math"/>
-            <w:lang w:val="pl-PL"/>
-          </w:rPr>
-          <m:t>(</m:t>
+          <m:t>ulp(</m:t>
         </m:r>
         <m:sSub>
           <m:sSubPr>
@@ -12219,14 +12208,7 @@
             <w:rFonts w:ascii="Cambria Math" w:hAnsi="Cambria Math"/>
             <w:lang w:val="pl-PL"/>
           </w:rPr>
-          <m:t>u</m:t>
-        </m:r>
-        <m:r>
-          <w:rPr>
-            <w:rFonts w:ascii="Cambria Math" w:hAnsi="Cambria Math"/>
-            <w:lang w:val="pl-PL"/>
-          </w:rPr>
-          <m:t>lp</m:t>
+          <m:t>ulp</m:t>
         </m:r>
       </m:oMath>
       <w:r>
@@ -12255,14 +12237,7 @@
             <w:rFonts w:ascii="Cambria Math" w:hAnsi="Cambria Math"/>
             <w:lang w:val="pl-PL"/>
           </w:rPr>
-          <m:t>u</m:t>
-        </m:r>
-        <m:r>
-          <w:rPr>
-            <w:rFonts w:ascii="Cambria Math" w:hAnsi="Cambria Math"/>
-            <w:lang w:val="pl-PL"/>
-          </w:rPr>
-          <m:t>lp</m:t>
+          <m:t>ulp</m:t>
         </m:r>
       </m:oMath>
       <w:r>
@@ -12350,14 +12325,7 @@
                     <w:rFonts w:ascii="Cambria Math" w:hAnsi="Cambria Math"/>
                     <w:lang w:val="pl-PL"/>
                   </w:rPr>
-                  <m:t>u</m:t>
-                </m:r>
-                <m:r>
-                  <w:rPr>
-                    <w:rFonts w:ascii="Cambria Math" w:hAnsi="Cambria Math"/>
-                    <w:lang w:val="pl-PL"/>
-                  </w:rPr>
-                  <m:t>lp(1)</m:t>
+                  <m:t>ulp(1)</m:t>
                 </m:r>
               </m:oMath>
             </m:oMathPara>
@@ -12380,28 +12348,7 @@
                     <w:rFonts w:ascii="Cambria Math" w:hAnsi="Cambria Math"/>
                     <w:lang w:val="pl-PL"/>
                   </w:rPr>
-                  <m:t>u</m:t>
-                </m:r>
-                <m:r>
-                  <w:rPr>
-                    <w:rFonts w:ascii="Cambria Math" w:hAnsi="Cambria Math"/>
-                    <w:lang w:val="pl-PL"/>
-                  </w:rPr>
-                  <m:t>lp(</m:t>
-                </m:r>
-                <m:r>
-                  <w:rPr>
-                    <w:rFonts w:ascii="Cambria Math" w:hAnsi="Cambria Math"/>
-                    <w:lang w:val="pl-PL"/>
-                  </w:rPr>
-                  <m:t>0.0</m:t>
-                </m:r>
-                <m:r>
-                  <w:rPr>
-                    <w:rFonts w:ascii="Cambria Math" w:hAnsi="Cambria Math"/>
-                    <w:lang w:val="pl-PL"/>
-                  </w:rPr>
-                  <m:t>1)</m:t>
+                  <m:t>ulp(0.01)</m:t>
                 </m:r>
               </m:oMath>
             </m:oMathPara>
@@ -12506,14 +12453,7 @@
                     <w:rFonts w:ascii="Cambria Math" w:eastAsia="Times New Roman" w:hAnsi="Cambria Math"/>
                     <w:lang w:bidi="ar-SA"/>
                   </w:rPr>
-                  <m:t>9.31</m:t>
-                </m:r>
-                <m:r>
-                  <w:rPr>
-                    <w:rFonts w:ascii="Cambria Math" w:eastAsia="Times New Roman" w:hAnsi="Cambria Math"/>
-                    <w:lang w:bidi="ar-SA"/>
-                  </w:rPr>
-                  <m:t>×</m:t>
+                  <m:t>9.31×</m:t>
                 </m:r>
                 <m:sSup>
                   <m:sSupPr>
@@ -12540,14 +12480,7 @@
                         <w:rFonts w:ascii="Cambria Math" w:eastAsia="Times New Roman" w:hAnsi="Cambria Math"/>
                         <w:lang w:bidi="ar-SA"/>
                       </w:rPr>
-                      <m:t>-</m:t>
-                    </m:r>
-                    <m:r>
-                      <w:rPr>
-                        <w:rFonts w:ascii="Cambria Math" w:eastAsia="Times New Roman" w:hAnsi="Cambria Math"/>
-                        <w:lang w:bidi="ar-SA"/>
-                      </w:rPr>
-                      <m:t>10</m:t>
+                      <m:t>-10</m:t>
                     </m:r>
                   </m:sup>
                 </m:sSup>
@@ -12612,14 +12545,7 @@
                     <w:rFonts w:ascii="Cambria Math" w:hAnsi="Cambria Math"/>
                     <w:lang w:val="pl-PL" w:bidi="ar-SA"/>
                   </w:rPr>
-                  <m:t>2.22</m:t>
-                </m:r>
-                <m:r>
-                  <w:rPr>
-                    <w:rFonts w:ascii="Cambria Math" w:hAnsi="Cambria Math"/>
-                    <w:lang w:val="pl-PL" w:bidi="ar-SA"/>
-                  </w:rPr>
-                  <m:t>×</m:t>
+                  <m:t>2.22×</m:t>
                 </m:r>
                 <m:sSup>
                   <m:sSupPr>
@@ -12671,14 +12597,7 @@
                     <w:rFonts w:ascii="Cambria Math" w:eastAsia="Times New Roman" w:hAnsi="Cambria Math"/>
                     <w:lang w:bidi="ar-SA"/>
                   </w:rPr>
-                  <m:t>1.73</m:t>
-                </m:r>
-                <m:r>
-                  <w:rPr>
-                    <w:rFonts w:ascii="Cambria Math" w:eastAsia="Times New Roman" w:hAnsi="Cambria Math"/>
-                    <w:lang w:bidi="ar-SA"/>
-                  </w:rPr>
-                  <m:t>×</m:t>
+                  <m:t>1.73×</m:t>
                 </m:r>
                 <m:sSup>
                   <m:sSupPr>
@@ -12705,14 +12624,7 @@
                         <w:rFonts w:ascii="Cambria Math" w:eastAsia="Times New Roman" w:hAnsi="Cambria Math"/>
                         <w:lang w:bidi="ar-SA"/>
                       </w:rPr>
-                      <m:t>-</m:t>
-                    </m:r>
-                    <m:r>
-                      <w:rPr>
-                        <w:rFonts w:ascii="Cambria Math" w:eastAsia="Times New Roman" w:hAnsi="Cambria Math"/>
-                        <w:lang w:bidi="ar-SA"/>
-                      </w:rPr>
-                      <m:t>18</m:t>
+                      <m:t>-18</m:t>
                     </m:r>
                   </m:sup>
                 </m:sSup>
@@ -16334,12 +16246,12 @@
           <w:rFonts w:ascii="Courier New" w:eastAsia="Times New Roman" w:hAnsi="Courier New" w:cs="Courier New"/>
         </w:rPr>
       </w:pPr>
-      <m:r>
+      <w:r>
         <w:rPr>
           <w:rFonts w:ascii="Cambria Math" w:hAnsi="Cambria Math"/>
         </w:rPr>
         <w:br/>
-      </m:r>
+      </w:r>
       <m:oMathPara>
         <m:oMath>
           <m:sSub>
@@ -17043,14 +16955,7 @@
             <w:rFonts w:ascii="Cambria Math" w:hAnsi="Cambria Math"/>
             <w:lang w:val="pl-PL"/>
           </w:rPr>
-          <m:t>u</m:t>
-        </m:r>
-        <m:r>
-          <w:rPr>
-            <w:rFonts w:ascii="Cambria Math" w:hAnsi="Cambria Math"/>
-            <w:lang w:val="pl-PL"/>
-          </w:rPr>
-          <m:t>lp</m:t>
+          <m:t>ulp</m:t>
         </m:r>
       </m:oMath>
       <w:r>
@@ -17325,7 +17230,7 @@
           <w:color w:val="000000"/>
           <w:sz w:val="24"/>
           <w:szCs w:val="24"/>
-          <w:lang w:bidi="ar-SA"/>
+          <w:lang w:val="pl-PL" w:bidi="ar-SA"/>
         </w:rPr>
       </w:pPr>
       <w:r>
@@ -17410,7 +17315,14 @@
             <w:rFonts w:ascii="Cambria Math" w:hAnsi="Cambria Math"/>
             <w:lang w:val="pl-PL"/>
           </w:rPr>
-          <m:t xml:space="preserve">+1&gt;1 </m:t>
+          <m:t>+1</m:t>
+        </m:r>
+        <m:r>
+          <w:rPr>
+            <w:rFonts w:ascii="Cambria Math" w:hAnsi="Cambria Math"/>
+            <w:lang w:val="pl-PL"/>
+          </w:rPr>
+          <m:t xml:space="preserve">&gt;1 </m:t>
         </m:r>
       </m:oMath>
       <w:r>
@@ -18230,13 +18142,13 @@
         <w:ind w:firstLine="708"/>
         <w:rPr>
           <w:rFonts w:eastAsia="Times New Roman"/>
-          <w:lang w:bidi="ar-SA"/>
+          <w:lang w:val="pl-PL" w:bidi="ar-SA"/>
         </w:rPr>
       </w:pPr>
       <w:r>
         <w:rPr>
           <w:rFonts w:eastAsia="Times New Roman"/>
-          <w:lang w:bidi="ar-SA"/>
+          <w:lang w:val="pl-PL" w:bidi="ar-SA"/>
         </w:rPr>
         <w:t xml:space="preserve">Dla typu float w standardzie IEEE 754: </w:t>
       </w:r>
@@ -18244,7 +18156,7 @@
         <m:r>
           <w:rPr>
             <w:rFonts w:ascii="Cambria Math" w:eastAsia="Times New Roman" w:hAnsi="Cambria Math"/>
-            <w:lang w:bidi="ar-SA"/>
+            <w:lang w:val="pl-PL" w:bidi="ar-SA"/>
           </w:rPr>
           <m:t>≈1.1920929×</m:t>
         </m:r>
@@ -18262,7 +18174,7 @@
             <m:r>
               <w:rPr>
                 <w:rFonts w:ascii="Cambria Math" w:eastAsia="Times New Roman" w:hAnsi="Cambria Math"/>
-                <w:lang w:bidi="ar-SA"/>
+                <w:lang w:val="pl-PL" w:bidi="ar-SA"/>
               </w:rPr>
               <m:t>10</m:t>
             </m:r>
@@ -18271,7 +18183,7 @@
             <m:r>
               <w:rPr>
                 <w:rFonts w:ascii="Cambria Math" w:eastAsia="Times New Roman" w:hAnsi="Cambria Math"/>
-                <w:lang w:bidi="ar-SA"/>
+                <w:lang w:val="pl-PL" w:bidi="ar-SA"/>
               </w:rPr>
               <m:t>-7</m:t>
             </m:r>
@@ -18284,13 +18196,13 @@
         <w:spacing w:after="200"/>
         <w:rPr>
           <w:rFonts w:eastAsia="Times New Roman"/>
-          <w:lang w:bidi="ar-SA"/>
+          <w:lang w:val="pl-PL" w:bidi="ar-SA"/>
         </w:rPr>
       </w:pPr>
       <w:r>
         <w:rPr>
           <w:rFonts w:eastAsia="Times New Roman"/>
-          <w:lang w:bidi="ar-SA"/>
+          <w:lang w:val="pl-PL" w:bidi="ar-SA"/>
         </w:rPr>
         <w:br w:type="page"/>
       </w:r>
@@ -18298,7 +18210,7 @@
     <w:p>
       <w:pPr>
         <w:rPr>
-          <w:lang w:bidi="ar-SA"/>
+          <w:lang w:val="pl-PL" w:bidi="ar-SA"/>
         </w:rPr>
       </w:pPr>
     </w:p>
@@ -19130,6 +19042,9 @@
         </w:rPr>
       </w:pPr>
       <w:r>
+        <w:rPr>
+          <w:lang w:val="pl-PL"/>
+        </w:rPr>
         <w:t xml:space="preserve">Maszynowy epsilon określa </w:t>
       </w:r>
       <w:r>
@@ -19137,13 +19052,20 @@
           <w:rStyle w:val="Pogrubienie"/>
           <w:b w:val="0"/>
           <w:color w:val="000000" w:themeColor="text1"/>
+          <w:lang w:val="pl-PL"/>
         </w:rPr>
         <w:t>granice dokładności obliczeń zmiennoprzecinkowych</w:t>
       </w:r>
       <w:r>
+        <w:rPr>
+          <w:lang w:val="pl-PL"/>
+        </w:rPr>
         <w:t>.</w:t>
       </w:r>
       <w:r>
+        <w:rPr>
+          <w:lang w:val="pl-PL"/>
+        </w:rPr>
         <w:br/>
       </w:r>
       <w:r>
@@ -19323,6 +19245,13 @@
     </w:p>
     <w:sdt>
       <w:sdtPr>
+        <w:rPr>
+          <w:caps w:val="0"/>
+          <w:color w:val="auto"/>
+          <w:spacing w:val="0"/>
+          <w:sz w:val="22"/>
+          <w:szCs w:val="22"/>
+        </w:rPr>
         <w:id w:val="388521225"/>
         <w:docPartObj>
           <w:docPartGallery w:val="Bibliographies"/>
@@ -19331,11 +19260,6 @@
       </w:sdtPr>
       <w:sdtEndPr>
         <w:rPr>
-          <w:caps w:val="0"/>
-          <w:color w:val="auto"/>
-          <w:spacing w:val="0"/>
-          <w:sz w:val="22"/>
-          <w:szCs w:val="22"/>
           <w:lang w:val="pl-PL"/>
         </w:rPr>
       </w:sdtEndPr>
@@ -19450,16 +19374,74 @@
     <w:p>
       <w:pPr>
         <w:tabs>
+          <w:tab w:val="left" w:pos="4132"/>
+        </w:tabs>
+        <w:rPr>
+          <w:lang w:bidi="ar-SA"/>
+        </w:rPr>
+      </w:pPr>
+      <w:r>
+        <w:rPr>
+          <w:lang w:bidi="ar-SA"/>
+        </w:rPr>
+        <w:tab/>
+      </w:r>
+    </w:p>
+    <w:p>
+      <w:pPr>
+        <w:tabs>
           <w:tab w:val="left" w:pos="7688"/>
         </w:tabs>
-        <w:rPr>
-          <w:lang w:bidi="ar-SA"/>
+        <w:jc w:val="center"/>
+        <w:rPr>
+          <w:lang w:val="pl-PL" w:bidi="ar-SA"/>
+        </w:rPr>
+      </w:pPr>
+      <w:r>
+        <w:rPr>
+          <w:b/>
+          <w:bCs/>
+          <w:lang w:val="pl-PL" w:bidi="ar-SA"/>
+        </w:rPr>
+        <w:t>Repozytorium projektu:</w:t>
+      </w:r>
+      <w:r>
+        <w:rPr>
+          <w:lang w:val="pl-PL" w:bidi="ar-SA"/>
+        </w:rPr>
+        <w:br/>
+        <w:t>Kod źródłowy oraz wyniki eksperymentów dostępne są w repozytorium GitHub:</w:t>
+      </w:r>
+      <w:r>
+        <w:rPr>
+          <w:lang w:val="pl-PL" w:bidi="ar-SA"/>
+        </w:rPr>
+        <w:br/>
+      </w:r>
+      <w:hyperlink r:id="rId14" w:tgtFrame="_new" w:history="1">
+        <w:r>
+          <w:rPr>
+            <w:rStyle w:val="Hipercze"/>
+            <w:lang w:val="pl-PL" w:bidi="ar-SA"/>
+          </w:rPr>
+          <w:t>https://github.com/SaberLS/calculation_methods_and_simulation_lab</w:t>
+        </w:r>
+      </w:hyperlink>
+    </w:p>
+    <w:p>
+      <w:pPr>
+        <w:tabs>
+          <w:tab w:val="left" w:pos="7688"/>
+        </w:tabs>
+        <w:jc w:val="center"/>
+        <w:rPr>
+          <w:lang w:val="pl-PL" w:bidi="ar-SA"/>
         </w:rPr>
       </w:pPr>
     </w:p>
     <w:sectPr>
-      <w:headerReference w:type="default" r:id="rId14"/>
-      <w:footerReference w:type="default" r:id="rId15"/>
+      <w:headerReference w:type="default" r:id="rId15"/>
+      <w:footerReference w:type="default" r:id="rId16"/>
       <w:pgSz w:w="11906" w:h="16838"/>
       <w:pgMar w:top="720" w:right="720" w:bottom="720" w:left="720" w:header="0" w:footer="708" w:gutter="0"/>
       <w:cols w:space="708"/>
@@ -19515,7 +19497,7 @@
         <w:rPr>
           <w:noProof/>
         </w:rPr>
-        <w:t>2</w:t>
+        <w:t>17</w:t>
       </w:r>
     </w:fldSimple>
   </w:p>
@@ -26389,327 +26371,6 @@
 </w:styles>
 </file>
 
-<file path=word/glossary/document.xml><?xml version="1.0" encoding="utf-8"?>
-<w:glossaryDocument xmlns:ve="http://schemas.openxmlformats.org/markup-compatibility/2006" xmlns:o="urn:schemas-microsoft-com:office:office" xmlns:r="http://schemas.openxmlformats.org/officeDocument/2006/relationships" xmlns:m="http://schemas.openxmlformats.org/officeDocument/2006/math" xmlns:v="urn:schemas-microsoft-com:vml" xmlns:wp="http://schemas.openxmlformats.org/drawingml/2006/wordprocessingDrawing" xmlns:w10="urn:schemas-microsoft-com:office:word" xmlns:w="http://schemas.openxmlformats.org/wordprocessingml/2006/main" xmlns:wne="http://schemas.microsoft.com/office/word/2006/wordml">
-  <w:docParts/>
-</w:glossaryDocument>
-</file>
-
-<file path=word/glossary/fontTable.xml><?xml version="1.0" encoding="utf-8"?>
-<w:fonts xmlns:r="http://schemas.openxmlformats.org/officeDocument/2006/relationships" xmlns:w="http://schemas.openxmlformats.org/wordprocessingml/2006/main">
-  <w:font w:name="Symbol">
-    <w:panose1 w:val="05050102010706020507"/>
-    <w:charset w:val="02"/>
-    <w:family w:val="roman"/>
-    <w:pitch w:val="variable"/>
-    <w:sig w:usb0="00000000" w:usb1="10000000" w:usb2="00000000" w:usb3="00000000" w:csb0="80000000" w:csb1="00000000"/>
-  </w:font>
-  <w:font w:name="Times New Roman">
-    <w:panose1 w:val="02020603050405020304"/>
-    <w:charset w:val="00"/>
-    <w:family w:val="roman"/>
-    <w:pitch w:val="variable"/>
-    <w:sig w:usb0="E0002EFF" w:usb1="C000785B" w:usb2="00000009" w:usb3="00000000" w:csb0="000001FF" w:csb1="00000000"/>
-  </w:font>
-  <w:font w:name="Courier New">
-    <w:panose1 w:val="02070309020205020404"/>
-    <w:charset w:val="00"/>
-    <w:family w:val="modern"/>
-    <w:pitch w:val="fixed"/>
-    <w:sig w:usb0="E0002EFF" w:usb1="C0007843" w:usb2="00000009" w:usb3="00000000" w:csb0="000001FF" w:csb1="00000000"/>
-  </w:font>
-  <w:font w:name="Wingdings">
-    <w:panose1 w:val="05000000000000000000"/>
-    <w:charset w:val="02"/>
-    <w:family w:val="auto"/>
-    <w:pitch w:val="variable"/>
-    <w:sig w:usb0="00000000" w:usb1="10000000" w:usb2="00000000" w:usb3="00000000" w:csb0="80000000" w:csb1="00000000"/>
-  </w:font>
-  <w:font w:name="Century Schoolbook">
-    <w:panose1 w:val="02040604050505020304"/>
-    <w:charset w:val="00"/>
-    <w:family w:val="roman"/>
-    <w:pitch w:val="variable"/>
-    <w:sig w:usb0="00000287" w:usb1="00000000" w:usb2="00000000" w:usb3="00000000" w:csb0="0000009F" w:csb1="00000000"/>
-  </w:font>
-  <w:font w:name="Tahoma">
-    <w:panose1 w:val="020B0604030504040204"/>
-    <w:charset w:val="00"/>
-    <w:family w:val="swiss"/>
-    <w:pitch w:val="variable"/>
-    <w:sig w:usb0="E1002EFF" w:usb1="C000605B" w:usb2="00000029" w:usb3="00000000" w:csb0="000101FF" w:csb1="00000000"/>
-  </w:font>
-  <w:font w:name="Cambria Math">
-    <w:panose1 w:val="02040503050406030204"/>
-    <w:charset w:val="00"/>
-    <w:family w:val="roman"/>
-    <w:pitch w:val="variable"/>
-    <w:sig w:usb0="E00006FF" w:usb1="420024FF" w:usb2="02000000" w:usb3="00000000" w:csb0="0000019F" w:csb1="00000000"/>
-  </w:font>
-  <w:font w:name="Calibri">
-    <w:panose1 w:val="020F0502020204030204"/>
-    <w:charset w:val="00"/>
-    <w:family w:val="swiss"/>
-    <w:pitch w:val="variable"/>
-    <w:sig w:usb0="E4002EFF" w:usb1="C000247B" w:usb2="00000009" w:usb3="00000000" w:csb0="000001FF" w:csb1="00000000"/>
-  </w:font>
-  <w:font w:name="Cambria">
-    <w:panose1 w:val="02040503050406030204"/>
-    <w:charset w:val="00"/>
-    <w:family w:val="roman"/>
-    <w:pitch w:val="variable"/>
-    <w:sig w:usb0="E00006FF" w:usb1="420024FF" w:usb2="02000000" w:usb3="00000000" w:csb0="0000019F" w:csb1="00000000"/>
-  </w:font>
-</w:fonts>
-</file>
-
-<file path=word/glossary/settings.xml><?xml version="1.0" encoding="utf-8"?>
-<w:settings xmlns:o="urn:schemas-microsoft-com:office:office" xmlns:r="http://schemas.openxmlformats.org/officeDocument/2006/relationships" xmlns:m="http://schemas.openxmlformats.org/officeDocument/2006/math" xmlns:v="urn:schemas-microsoft-com:vml" xmlns:w10="urn:schemas-microsoft-com:office:word" xmlns:w="http://schemas.openxmlformats.org/wordprocessingml/2006/main" xmlns:sl="http://schemas.openxmlformats.org/schemaLibrary/2006/main">
-  <w:view w:val="normal"/>
-  <w:defaultTabStop w:val="720"/>
-  <w:characterSpacingControl w:val="doNotCompress"/>
-  <w:compat>
-    <w:useFELayout/>
-  </w:compat>
-  <w:rsids>
-    <w:rsidRoot w:val="00D64660"/>
-    <w:rsid w:val="001034D5"/>
-    <w:rsid w:val="003C25E8"/>
-    <w:rsid w:val="00543BA2"/>
-    <w:rsid w:val="009334F3"/>
-    <w:rsid w:val="00D64660"/>
-    <w:rsid w:val="00DD59C1"/>
-    <w:rsid w:val="00EE58F3"/>
-    <w:rsid w:val="00FD308D"/>
-  </w:rsids>
-  <m:mathPr>
-    <m:mathFont m:val="Cambria Math"/>
-    <m:brkBin m:val="before"/>
-    <m:brkBinSub m:val="--"/>
-    <m:smallFrac m:val="off"/>
-    <m:dispDef/>
-    <m:lMargin m:val="0"/>
-    <m:rMargin m:val="0"/>
-    <m:defJc m:val="centerGroup"/>
-    <m:wrapIndent m:val="1440"/>
-    <m:intLim m:val="subSup"/>
-    <m:naryLim m:val="undOvr"/>
-  </m:mathPr>
-  <w:themeFontLang w:val="en-US"/>
-  <w:clrSchemeMapping w:bg1="light1" w:t1="dark1" w:bg2="light2" w:t2="dark2" w:accent1="accent1" w:accent2="accent2" w:accent3="accent3" w:accent4="accent4" w:accent5="accent5" w:accent6="accent6" w:hyperlink="hyperlink" w:followedHyperlink="followedHyperlink"/>
-  <w:decimalSymbol w:val="."/>
-  <w:listSeparator w:val=","/>
-</w:settings>
-</file>
-
-<file path=word/glossary/styles.xml><?xml version="1.0" encoding="utf-8"?>
-<w:styles xmlns:r="http://schemas.openxmlformats.org/officeDocument/2006/relationships" xmlns:w="http://schemas.openxmlformats.org/wordprocessingml/2006/main">
-  <w:docDefaults>
-    <w:rPrDefault>
-      <w:rPr>
-        <w:rFonts w:asciiTheme="minorHAnsi" w:eastAsiaTheme="minorEastAsia" w:hAnsiTheme="minorHAnsi" w:cstheme="minorBidi"/>
-        <w:sz w:val="22"/>
-        <w:szCs w:val="22"/>
-        <w:lang w:val="en-US" w:eastAsia="en-US" w:bidi="ar-SA"/>
-      </w:rPr>
-    </w:rPrDefault>
-    <w:pPrDefault>
-      <w:pPr>
-        <w:spacing w:after="200" w:line="276" w:lineRule="auto"/>
-      </w:pPr>
-    </w:pPrDefault>
-  </w:docDefaults>
-  <w:latentStyles w:defLockedState="0" w:defUIPriority="99" w:defSemiHidden="1" w:defUnhideWhenUsed="1" w:defQFormat="0" w:count="267">
-    <w:lsdException w:name="Normal" w:semiHidden="0" w:uiPriority="0" w:unhideWhenUsed="0" w:qFormat="1"/>
-    <w:lsdException w:name="heading 1" w:semiHidden="0" w:uiPriority="9" w:unhideWhenUsed="0" w:qFormat="1"/>
-    <w:lsdException w:name="heading 2" w:uiPriority="9" w:qFormat="1"/>
-    <w:lsdException w:name="heading 3" w:uiPriority="9" w:qFormat="1"/>
-    <w:lsdException w:name="heading 4" w:uiPriority="9" w:qFormat="1"/>
-    <w:lsdException w:name="heading 5" w:uiPriority="9" w:qFormat="1"/>
-    <w:lsdException w:name="heading 6" w:uiPriority="9" w:qFormat="1"/>
-    <w:lsdException w:name="heading 7" w:uiPriority="9" w:qFormat="1"/>
-    <w:lsdException w:name="heading 8" w:uiPriority="9" w:qFormat="1"/>
-    <w:lsdException w:name="heading 9" w:uiPriority="9" w:qFormat="1"/>
-    <w:lsdException w:name="toc 1" w:uiPriority="39"/>
-    <w:lsdException w:name="toc 2" w:uiPriority="39"/>
-    <w:lsdException w:name="toc 3" w:uiPriority="39"/>
-    <w:lsdException w:name="toc 4" w:uiPriority="39"/>
-    <w:lsdException w:name="toc 5" w:uiPriority="39"/>
-    <w:lsdException w:name="toc 6" w:uiPriority="39"/>
-    <w:lsdException w:name="toc 7" w:uiPriority="39"/>
-    <w:lsdException w:name="toc 8" w:uiPriority="39"/>
-    <w:lsdException w:name="toc 9" w:uiPriority="39"/>
-    <w:lsdException w:name="caption" w:uiPriority="35" w:qFormat="1"/>
-    <w:lsdException w:name="Title" w:semiHidden="0" w:uiPriority="10" w:unhideWhenUsed="0" w:qFormat="1"/>
-    <w:lsdException w:name="Default Paragraph Font" w:uiPriority="1"/>
-    <w:lsdException w:name="Subtitle" w:semiHidden="0" w:uiPriority="11" w:unhideWhenUsed="0" w:qFormat="1"/>
-    <w:lsdException w:name="Strong" w:semiHidden="0" w:uiPriority="22" w:unhideWhenUsed="0" w:qFormat="1"/>
-    <w:lsdException w:name="Emphasis" w:semiHidden="0" w:uiPriority="20" w:unhideWhenUsed="0" w:qFormat="1"/>
-    <w:lsdException w:name="Table Grid" w:semiHidden="0" w:uiPriority="59" w:unhideWhenUsed="0"/>
-    <w:lsdException w:name="Placeholder Text" w:unhideWhenUsed="0"/>
-    <w:lsdException w:name="No Spacing" w:semiHidden="0" w:uiPriority="1" w:unhideWhenUsed="0" w:qFormat="1"/>
-    <w:lsdException w:name="Light Shading" w:semiHidden="0" w:uiPriority="60" w:unhideWhenUsed="0"/>
-    <w:lsdException w:name="Light List" w:semiHidden="0" w:uiPriority="61" w:unhideWhenUsed="0"/>
-    <w:lsdException w:name="Light Grid" w:semiHidden="0" w:uiPriority="62" w:unhideWhenUsed="0"/>
-    <w:lsdException w:name="Medium Shading 1" w:semiHidden="0" w:uiPriority="63" w:unhideWhenUsed="0"/>
-    <w:lsdException w:name="Medium Shading 2" w:semiHidden="0" w:uiPriority="64" w:unhideWhenUsed="0"/>
-    <w:lsdException w:name="Medium List 1" w:semiHidden="0" w:uiPriority="65" w:unhideWhenUsed="0"/>
-    <w:lsdException w:name="Medium List 2" w:semiHidden="0" w:uiPriority="66" w:unhideWhenUsed="0"/>
-    <w:lsdException w:name="Medium Grid 1" w:semiHidden="0" w:uiPriority="67" w:unhideWhenUsed="0"/>
-    <w:lsdException w:name="Medium Grid 2" w:semiHidden="0" w:uiPriority="68" w:unhideWhenUsed="0"/>
-    <w:lsdException w:name="Medium Grid 3" w:semiHidden="0" w:uiPriority="69" w:unhideWhenUsed="0"/>
-    <w:lsdException w:name="Dark List" w:semiHidden="0" w:uiPriority="70" w:unhideWhenUsed="0"/>
-    <w:lsdException w:name="Colorful Shading" w:semiHidden="0" w:uiPriority="71" w:unhideWhenUsed="0"/>
-    <w:lsdException w:name="Colorful List" w:semiHidden="0" w:uiPriority="72" w:unhideWhenUsed="0"/>
-    <w:lsdException w:name="Colorful Grid" w:semiHidden="0" w:uiPriority="73" w:unhideWhenUsed="0"/>
-    <w:lsdException w:name="Light Shading Accent 1" w:semiHidden="0" w:uiPriority="60" w:unhideWhenUsed="0"/>
-    <w:lsdException w:name="Light List Accent 1" w:semiHidden="0" w:uiPriority="61" w:unhideWhenUsed="0"/>
-    <w:lsdException w:name="Light Grid Accent 1" w:semiHidden="0" w:uiPriority="62" w:unhideWhenUsed="0"/>
-    <w:lsdException w:name="Medium Shading 1 Accent 1" w:semiHidden="0" w:uiPriority="63" w:unhideWhenUsed="0"/>
-    <w:lsdException w:name="Medium Shading 2 Accent 1" w:semiHidden="0" w:uiPriority="64" w:unhideWhenUsed="0"/>
-    <w:lsdException w:name="Medium List 1 Accent 1" w:semiHidden="0" w:uiPriority="65" w:unhideWhenUsed="0"/>
-    <w:lsdException w:name="Revision" w:unhideWhenUsed="0"/>
-    <w:lsdException w:name="List Paragraph" w:semiHidden="0" w:uiPriority="34" w:unhideWhenUsed="0" w:qFormat="1"/>
-    <w:lsdException w:name="Quote" w:semiHidden="0" w:uiPriority="29" w:unhideWhenUsed="0" w:qFormat="1"/>
-    <w:lsdException w:name="Intense Quote" w:semiHidden="0" w:uiPriority="30" w:unhideWhenUsed="0" w:qFormat="1"/>
-    <w:lsdException w:name="Medium List 2 Accent 1" w:semiHidden="0" w:uiPriority="66" w:unhideWhenUsed="0"/>
-    <w:lsdException w:name="Medium Grid 1 Accent 1" w:semiHidden="0" w:uiPriority="67" w:unhideWhenUsed="0"/>
-    <w:lsdException w:name="Medium Grid 2 Accent 1" w:semiHidden="0" w:uiPriority="68" w:unhideWhenUsed="0"/>
-    <w:lsdException w:name="Medium Grid 3 Accent 1" w:semiHidden="0" w:uiPriority="69" w:unhideWhenUsed="0"/>
-    <w:lsdException w:name="Dark List Accent 1" w:semiHidden="0" w:uiPriority="70" w:unhideWhenUsed="0"/>
-    <w:lsdException w:name="Colorful Shading Accent 1" w:semiHidden="0" w:uiPriority="71" w:unhideWhenUsed="0"/>
-    <w:lsdException w:name="Colorful List Accent 1" w:semiHidden="0" w:uiPriority="72" w:unhideWhenUsed="0"/>
-    <w:lsdException w:name="Colorful Grid Accent 1" w:semiHidden="0" w:uiPriority="73" w:unhideWhenUsed="0"/>
-    <w:lsdException w:name="Light Shading Accent 2" w:semiHidden="0" w:uiPriority="60" w:unhideWhenUsed="0"/>
-    <w:lsdException w:name="Light List Accent 2" w:semiHidden="0" w:uiPriority="61" w:unhideWhenUsed="0"/>
-    <w:lsdException w:name="Light Grid Accent 2" w:semiHidden="0" w:uiPriority="62" w:unhideWhenUsed="0"/>
-    <w:lsdException w:name="Medium Shading 1 Accent 2" w:semiHidden="0" w:uiPriority="63" w:unhideWhenUsed="0"/>
-    <w:lsdException w:name="Medium Shading 2 Accent 2" w:semiHidden="0" w:uiPriority="64" w:unhideWhenUsed="0"/>
-    <w:lsdException w:name="Medium List 1 Accent 2" w:semiHidden="0" w:uiPriority="65" w:unhideWhenUsed="0"/>
-    <w:lsdException w:name="Medium List 2 Accent 2" w:semiHidden="0" w:uiPriority="66" w:unhideWhenUsed="0"/>
-    <w:lsdException w:name="Medium Grid 1 Accent 2" w:semiHidden="0" w:uiPriority="67" w:unhideWhenUsed="0"/>
-    <w:lsdException w:name="Medium Grid 2 Accent 2" w:semiHidden="0" w:uiPriority="68" w:unhideWhenUsed="0"/>
-    <w:lsdException w:name="Medium Grid 3 Accent 2" w:semiHidden="0" w:uiPriority="69" w:unhideWhenUsed="0"/>
-    <w:lsdException w:name="Dark List Accent 2" w:semiHidden="0" w:uiPriority="70" w:unhideWhenUsed="0"/>
-    <w:lsdException w:name="Colorful Shading Accent 2" w:semiHidden="0" w:uiPriority="71" w:unhideWhenUsed="0"/>
-    <w:lsdException w:name="Colorful List Accent 2" w:semiHidden="0" w:uiPriority="72" w:unhideWhenUsed="0"/>
-    <w:lsdException w:name="Colorful Grid Accent 2" w:semiHidden="0" w:uiPriority="73" w:unhideWhenUsed="0"/>
-    <w:lsdException w:name="Light Shading Accent 3" w:semiHidden="0" w:uiPriority="60" w:unhideWhenUsed="0"/>
-    <w:lsdException w:name="Light List Accent 3" w:semiHidden="0" w:uiPriority="61" w:unhideWhenUsed="0"/>
-    <w:lsdException w:name="Light Grid Accent 3" w:semiHidden="0" w:uiPriority="62" w:unhideWhenUsed="0"/>
-    <w:lsdException w:name="Medium Shading 1 Accent 3" w:semiHidden="0" w:uiPriority="63" w:unhideWhenUsed="0"/>
-    <w:lsdException w:name="Medium Shading 2 Accent 3" w:semiHidden="0" w:uiPriority="64" w:unhideWhenUsed="0"/>
-    <w:lsdException w:name="Medium List 1 Accent 3" w:semiHidden="0" w:uiPriority="65" w:unhideWhenUsed="0"/>
-    <w:lsdException w:name="Medium List 2 Accent 3" w:semiHidden="0" w:uiPriority="66" w:unhideWhenUsed="0"/>
-    <w:lsdException w:name="Medium Grid 1 Accent 3" w:semiHidden="0" w:uiPriority="67" w:unhideWhenUsed="0"/>
-    <w:lsdException w:name="Medium Grid 2 Accent 3" w:semiHidden="0" w:uiPriority="68" w:unhideWhenUsed="0"/>
-    <w:lsdException w:name="Medium Grid 3 Accent 3" w:semiHidden="0" w:uiPriority="69" w:unhideWhenUsed="0"/>
-    <w:lsdException w:name="Dark List Accent 3" w:semiHidden="0" w:uiPriority="70" w:unhideWhenUsed="0"/>
-    <w:lsdException w:name="Colorful Shading Accent 3" w:semiHidden="0" w:uiPriority="71" w:unhideWhenUsed="0"/>
-    <w:lsdException w:name="Colorful List Accent 3" w:semiHidden="0" w:uiPriority="72" w:unhideWhenUsed="0"/>
-    <w:lsdException w:name="Colorful Grid Accent 3" w:semiHidden="0" w:uiPriority="73" w:unhideWhenUsed="0"/>
-    <w:lsdException w:name="Light Shading Accent 4" w:semiHidden="0" w:uiPriority="60" w:unhideWhenUsed="0"/>
-    <w:lsdException w:name="Light List Accent 4" w:semiHidden="0" w:uiPriority="61" w:unhideWhenUsed="0"/>
-    <w:lsdException w:name="Light Grid Accent 4" w:semiHidden="0" w:uiPriority="62" w:unhideWhenUsed="0"/>
-    <w:lsdException w:name="Medium Shading 1 Accent 4" w:semiHidden="0" w:uiPriority="63" w:unhideWhenUsed="0"/>
-    <w:lsdException w:name="Medium Shading 2 Accent 4" w:semiHidden="0" w:uiPriority="64" w:unhideWhenUsed="0"/>
-    <w:lsdException w:name="Medium List 1 Accent 4" w:semiHidden="0" w:uiPriority="65" w:unhideWhenUsed="0"/>
-    <w:lsdException w:name="Medium List 2 Accent 4" w:semiHidden="0" w:uiPriority="66" w:unhideWhenUsed="0"/>
-    <w:lsdException w:name="Medium Grid 1 Accent 4" w:semiHidden="0" w:uiPriority="67" w:unhideWhenUsed="0"/>
-    <w:lsdException w:name="Medium Grid 2 Accent 4" w:semiHidden="0" w:uiPriority="68" w:unhideWhenUsed="0"/>
-    <w:lsdException w:name="Medium Grid 3 Accent 4" w:semiHidden="0" w:uiPriority="69" w:unhideWhenUsed="0"/>
-    <w:lsdException w:name="Dark List Accent 4" w:semiHidden="0" w:uiPriority="70" w:unhideWhenUsed="0"/>
-    <w:lsdException w:name="Colorful Shading Accent 4" w:semiHidden="0" w:uiPriority="71" w:unhideWhenUsed="0"/>
-    <w:lsdException w:name="Colorful List Accent 4" w:semiHidden="0" w:uiPriority="72" w:unhideWhenUsed="0"/>
-    <w:lsdException w:name="Colorful Grid Accent 4" w:semiHidden="0" w:uiPriority="73" w:unhideWhenUsed="0"/>
-    <w:lsdException w:name="Light Shading Accent 5" w:semiHidden="0" w:uiPriority="60" w:unhideWhenUsed="0"/>
-    <w:lsdException w:name="Light List Accent 5" w:semiHidden="0" w:uiPriority="61" w:unhideWhenUsed="0"/>
-    <w:lsdException w:name="Light Grid Accent 5" w:semiHidden="0" w:uiPriority="62" w:unhideWhenUsed="0"/>
-    <w:lsdException w:name="Medium Shading 1 Accent 5" w:semiHidden="0" w:uiPriority="63" w:unhideWhenUsed="0"/>
-    <w:lsdException w:name="Medium Shading 2 Accent 5" w:semiHidden="0" w:uiPriority="64" w:unhideWhenUsed="0"/>
-    <w:lsdException w:name="Medium List 1 Accent 5" w:semiHidden="0" w:uiPriority="65" w:unhideWhenUsed="0"/>
-    <w:lsdException w:name="Medium List 2 Accent 5" w:semiHidden="0" w:uiPriority="66" w:unhideWhenUsed="0"/>
-    <w:lsdException w:name="Medium Grid 1 Accent 5" w:semiHidden="0" w:uiPriority="67" w:unhideWhenUsed="0"/>
-    <w:lsdException w:name="Medium Grid 2 Accent 5" w:semiHidden="0" w:uiPriority="68" w:unhideWhenUsed="0"/>
-    <w:lsdException w:name="Medium Grid 3 Accent 5" w:semiHidden="0" w:uiPriority="69" w:unhideWhenUsed="0"/>
-    <w:lsdException w:name="Dark List Accent 5" w:semiHidden="0" w:uiPriority="70" w:unhideWhenUsed="0"/>
-    <w:lsdException w:name="Colorful Shading Accent 5" w:semiHidden="0" w:uiPriority="71" w:unhideWhenUsed="0"/>
-    <w:lsdException w:name="Colorful List Accent 5" w:semiHidden="0" w:uiPriority="72" w:unhideWhenUsed="0"/>
-    <w:lsdException w:name="Colorful Grid Accent 5" w:semiHidden="0" w:uiPriority="73" w:unhideWhenUsed="0"/>
-    <w:lsdException w:name="Light Shading Accent 6" w:semiHidden="0" w:uiPriority="60" w:unhideWhenUsed="0"/>
-    <w:lsdException w:name="Light List Accent 6" w:semiHidden="0" w:uiPriority="61" w:unhideWhenUsed="0"/>
-    <w:lsdException w:name="Light Grid Accent 6" w:semiHidden="0" w:uiPriority="62" w:unhideWhenUsed="0"/>
-    <w:lsdException w:name="Medium Shading 1 Accent 6" w:semiHidden="0" w:uiPriority="63" w:unhideWhenUsed="0"/>
-    <w:lsdException w:name="Medium Shading 2 Accent 6" w:semiHidden="0" w:uiPriority="64" w:unhideWhenUsed="0"/>
-    <w:lsdException w:name="Medium List 1 Accent 6" w:semiHidden="0" w:uiPriority="65" w:unhideWhenUsed="0"/>
-    <w:lsdException w:name="Medium List 2 Accent 6" w:semiHidden="0" w:uiPriority="66" w:unhideWhenUsed="0"/>
-    <w:lsdException w:name="Medium Grid 1 Accent 6" w:semiHidden="0" w:uiPriority="67" w:unhideWhenUsed="0"/>
-    <w:lsdException w:name="Medium Grid 2 Accent 6" w:semiHidden="0" w:uiPriority="68" w:unhideWhenUsed="0"/>
-    <w:lsdException w:name="Medium Grid 3 Accent 6" w:semiHidden="0" w:uiPriority="69" w:unhideWhenUsed="0"/>
-    <w:lsdException w:name="Dark List Accent 6" w:semiHidden="0" w:uiPriority="70" w:unhideWhenUsed="0"/>
-    <w:lsdException w:name="Colorful Shading Accent 6" w:semiHidden="0" w:uiPriority="71" w:unhideWhenUsed="0"/>
-    <w:lsdException w:name="Colorful List Accent 6" w:semiHidden="0" w:uiPriority="72" w:unhideWhenUsed="0"/>
-    <w:lsdException w:name="Colorful Grid Accent 6" w:semiHidden="0" w:uiPriority="73" w:unhideWhenUsed="0"/>
-    <w:lsdException w:name="Subtle Emphasis" w:semiHidden="0" w:uiPriority="19" w:unhideWhenUsed="0" w:qFormat="1"/>
-    <w:lsdException w:name="Intense Emphasis" w:semiHidden="0" w:uiPriority="21" w:unhideWhenUsed="0" w:qFormat="1"/>
-    <w:lsdException w:name="Subtle Reference" w:semiHidden="0" w:uiPriority="31" w:unhideWhenUsed="0" w:qFormat="1"/>
-    <w:lsdException w:name="Intense Reference" w:semiHidden="0" w:uiPriority="32" w:unhideWhenUsed="0" w:qFormat="1"/>
-    <w:lsdException w:name="Book Title" w:semiHidden="0" w:uiPriority="33" w:unhideWhenUsed="0" w:qFormat="1"/>
-    <w:lsdException w:name="Bibliography" w:uiPriority="37"/>
-    <w:lsdException w:name="TOC Heading" w:uiPriority="39" w:qFormat="1"/>
-  </w:latentStyles>
-  <w:style w:type="paragraph" w:default="1" w:styleId="Normalny">
-    <w:name w:val="Normal"/>
-    <w:qFormat/>
-    <w:rsid w:val="00543BA2"/>
-  </w:style>
-  <w:style w:type="character" w:default="1" w:styleId="Domylnaczcionkaakapitu">
-    <w:name w:val="Default Paragraph Font"/>
-    <w:uiPriority w:val="1"/>
-    <w:semiHidden/>
-    <w:unhideWhenUsed/>
-  </w:style>
-  <w:style w:type="table" w:default="1" w:styleId="Standardowy">
-    <w:name w:val="Normal Table"/>
-    <w:uiPriority w:val="99"/>
-    <w:semiHidden/>
-    <w:unhideWhenUsed/>
-    <w:qFormat/>
-    <w:tblPr>
-      <w:tblInd w:w="0" w:type="dxa"/>
-      <w:tblCellMar>
-        <w:top w:w="0" w:type="dxa"/>
-        <w:left w:w="108" w:type="dxa"/>
-        <w:bottom w:w="0" w:type="dxa"/>
-        <w:right w:w="108" w:type="dxa"/>
-      </w:tblCellMar>
-    </w:tblPr>
-  </w:style>
-  <w:style w:type="numbering" w:default="1" w:styleId="Bezlisty">
-    <w:name w:val="No List"/>
-    <w:uiPriority w:val="99"/>
-    <w:semiHidden/>
-    <w:unhideWhenUsed/>
-  </w:style>
-  <w:style w:type="character" w:styleId="Tekstzastpczy">
-    <w:name w:val="Placeholder Text"/>
-    <w:basedOn w:val="Domylnaczcionkaakapitu"/>
-    <w:uiPriority w:val="99"/>
-    <w:semiHidden/>
-    <w:rsid w:val="003C25E8"/>
-    <w:rPr>
-      <w:color w:val="808080"/>
-    </w:rPr>
-  </w:style>
-</w:styles>
-</file>
-
-<file path=word/glossary/webSettings.xml><?xml version="1.0" encoding="utf-8"?>
-<w:webSettings xmlns:r="http://schemas.openxmlformats.org/officeDocument/2006/relationships" xmlns:w="http://schemas.openxmlformats.org/wordprocessingml/2006/main">
-  <w:optimizeForBrowser/>
-</w:webSettings>
-</file>
-
 <file path=word/theme/theme1.xml><?xml version="1.0" encoding="utf-8"?>
 <a:theme xmlns:a="http://schemas.openxmlformats.org/drawingml/2006/main" name="Wykusz">
   <a:themeElements>

</xml_diff>